<commit_message>
feat: embed default Apps Script URL for instant live sync with Google Sheets
</commit_message>
<xml_diff>
--- a/địa chỉ.docx
+++ b/địa chỉ.docx
@@ -11,6 +11,13 @@
           <w:t>https://docs.google.com/spreadsheets/d/1zwXiZKDCN14Rx3LOVEI54JYvABMXz2TDH3w_Rv8bu7c/edit?gid=1957057365#gid=1957057365</w:t>
         </w:r>
       </w:hyperlink>
+    </w:p>
+    <w:p/>
+    <w:p/>
+    <w:p>
+      <w:r>
+        <w:t>https://script.google.com/macros/s/AKfycbx14yyyw2fJ4rW3OdxcfOlli8OKPlr84-vxEhPkI9yMcTnM2BT8WeDs75hzx9h0mEPs/exec</w:t>
+      </w:r>
     </w:p>
     <w:p/>
     <w:sectPr>

</xml_diff>

<commit_message>
Update title header, footer text and remove CHUYEN MUC
</commit_message>
<xml_diff>
--- a/địa chỉ.docx
+++ b/địa chỉ.docx
@@ -15,8 +15,19 @@
     <w:p/>
     <w:p/>
     <w:p>
+      <w:hyperlink r:id="rId5" w:history="1">
+        <w:r>
+          <w:rPr>
+            <w:rStyle w:val="Hyperlink"/>
+          </w:rPr>
+          <w:t>https://script.google.com/macros/s/AKfycbx14yyyw2fJ4rW3OdxcfOlli8OKPlr84-vxEhPkI9yMcTnM2BT8WeDs75hzx9h0mEPs/exec</w:t>
+        </w:r>
+      </w:hyperlink>
+    </w:p>
+    <w:p/>
+    <w:p>
       <w:r>
-        <w:t>https://script.google.com/macros/s/AKfycbx14yyyw2fJ4rW3OdxcfOlli8OKPlr84-vxEhPkI9yMcTnM2BT8WeDs75hzx9h0mEPs/exec</w:t>
+        <w:t>https://congno-csht.vercel.app/</w:t>
       </w:r>
     </w:p>
     <w:p/>

</xml_diff>